<commit_message>
Registro interno de continuidade; 10 correções mecânicas de referência temporal; relatório com pendências sem spoilers; saídas regeneradas
Co-Authored-By: Claude Opus 5.5 <noreply@anthropic.com>
Claude-Session: https://claude.ai/code/session_01BuEux7GtVCf6Je6ZHYUtx2
</commit_message>
<xml_diff>
--- a/exportacoes/MANUSCRITO_V1_REVISAO_LINGUAGEM.docx
+++ b/exportacoes/MANUSCRITO_V1_REVISAO_LINGUAGEM.docx
@@ -4738,7 +4738,7 @@
         <w:pStyle w:val="BodyText"/>
       </w:pPr>
       <w:r>
-        <w:t xml:space="preserve">Ione hesitou. Depois foi até a mesa de Fil, onde se acumulavam os papéis que chegavam de toda parte pelos relés do Átrio, e remexeu na pilha até achar uma folha amarela, de uma agência de notícias das Cidades de Bronze, que tinha chegado pela porta de Vhalessa uma hora antes e que ninguém tinha lido. Leu em silêncio e a entregou a Aurelia.</w:t>
+        <w:t xml:space="preserve">Ione hesitou. Depois foi até a mesa de Fil, onde se acumulavam os papéis que chegavam de toda parte pelos relés do Átrio, e remexeu na pilha até achar uma folha amarela, de uma agência de notícias das Cidades de Bronze, que tinha chegado pela porta de Vhalessa pouco antes e que ninguém tinha lido. Leu em silêncio e a entregou a Aurelia.</w:t>
       </w:r>
     </w:p>
     <w:p>
@@ -8402,7 +8402,7 @@
         <w:t xml:space="preserve"> </w:t>
       </w:r>
       <w:r>
-        <w:t xml:space="preserve">se ajoelhassem. Hoje de manhã pedi a um homem que vende bolinhos de grão-de-bico que não se ajoelhasse. Ontem pedi a um mestre de guilda. O senhor seria o primeiro, em muito tempo, a não me obrigar a pedir.</w:t>
+        <w:t xml:space="preserve">se ajoelhassem. Ontem à noite pedi a um homem que vende bolinhos de grão-de-bico que não se ajoelhasse. Ontem pedi a um mestre de guilda. O senhor seria o primeiro, em muito tempo, a não me obrigar a pedir.</w:t>
       </w:r>
     </w:p>
     <w:p>
@@ -16194,7 +16194,7 @@
         <w:pStyle w:val="BodyText"/>
       </w:pPr>
       <w:r>
-        <w:t xml:space="preserve">Ele subiu atrás, só para ver — não entendia de reservatórios, e ela deixou isso claro em menos de um minuto. Ficou encostado no batente da porta de carvalho reforçado, a que o doutor Orsk tinha aberto para o Carrasco duas noites antes, e olhou.</w:t>
+        <w:t xml:space="preserve">Ele subiu atrás, só para ver — não entendia de reservatórios, e ela deixou isso claro em menos de um minuto. Ficou encostado no batente da porta de carvalho reforçado, a que o doutor Orsk tinha aberto para o Carrasco quatro noites antes, e olhou.</w:t>
       </w:r>
     </w:p>
     <w:p>
@@ -16795,7 +16795,7 @@
         <w:pStyle w:val="BodyText"/>
       </w:pPr>
       <w:r>
-        <w:t xml:space="preserve">— Ele disse ontem, na tenda — falou a Soberania —, que Calvenor lutou até o fim.</w:t>
+        <w:t xml:space="preserve">— Ele disse anteontem, na tenda — falou a Soberania —, que Calvenor lutou até o fim.</w:t>
       </w:r>
     </w:p>
     <w:p>
@@ -20634,7 +20634,7 @@
         <w:pStyle w:val="BodyText"/>
       </w:pPr>
       <w:r>
-        <w:t xml:space="preserve">— Eron Tahl. Mercenário registrado. Número quatro mil e onze. Ele me disse, para o caso de eu querer processar. — Ilan abriu os olhos. — É o melhor lutador que eu já enfrentei, Aurelia. Ele não tem nada para ler. E sabia exatamente como eu ia lutar, porque um homem que eu derrotei há quatro dias anda contando a história em todas as tavernas da margem sul.</w:t>
+        <w:t xml:space="preserve">— Eron Tahl. Mercenário registrado. Número quatro mil e onze. Ele me disse, para o caso de eu querer processar. — Ilan abriu os olhos. — É o melhor lutador que eu já enfrentei, Aurelia. Ele não tem nada para ler. E sabia exatamente como eu ia lutar, porque um homem que eu derrotei há cinco dias anda contando a história em todas as tavernas da margem sul.</w:t>
       </w:r>
     </w:p>
     <w:p>
@@ -21591,7 +21591,7 @@
         <w:pStyle w:val="BodyText"/>
       </w:pPr>
       <w:r>
-        <w:t xml:space="preserve">— Os manômetros da Casa são da Casa. Ligados às Cisternas por tubos que passam pela Casa, calibrados por técnicos da Casa, lidos na galeria de controle da Casa. Se alguém quisesse que os manômetros dissessem que está tudo bem, Nara, não precisaria mexer nas Cisternas. Bastaria mexer nos manômetros. — Ele fez uma pausa. — Anteontem, no alto da torre, alguém pôs no piso uma trilha de âncoras que respondiam a qualquer sondagem com a mesma resposta, para quem perguntasse duas vezes no mesmo ritmo achar que estava tudo bem. Eu não confio mais em nada nesta cidade que só tenha um jeito de ser medido.</w:t>
+        <w:t xml:space="preserve">— Os manômetros da Casa são da Casa. Ligados às Cisternas por tubos que passam pela Casa, calibrados por técnicos da Casa, lidos na galeria de controle da Casa. Se alguém quisesse que os manômetros dissessem que está tudo bem, Nara, não precisaria mexer nas Cisternas. Bastaria mexer nos manômetros. — Ele fez uma pausa. — Há três dias, no alto da torre, alguém pôs no piso uma trilha de âncoras que respondiam a qualquer sondagem com a mesma resposta, para quem perguntasse duas vezes no mesmo ritmo achar que estava tudo bem. Eu não confio mais em nada nesta cidade que só tenha um jeito de ser medido.</w:t>
       </w:r>
     </w:p>
     <w:p>
@@ -21963,7 +21963,7 @@
         <w:pStyle w:val="BodyText"/>
       </w:pPr>
       <w:r>
-        <w:t xml:space="preserve">— Eu andei mil cento e quarenta degraus atrás de uma armadilha anteontem. — A deusa se levantou da neve e limpou o casaco com as mãos. — Tampas de bronze vão ser um descanso.</w:t>
+        <w:t xml:space="preserve">— Eu andei mil cento e quarenta degraus atrás de uma armadilha há três dias. — A deusa se levantou da neve e limpou o casaco com as mãos. — Tampas de bronze vão ser um descanso.</w:t>
       </w:r>
     </w:p>
     <w:p>
@@ -30126,7 +30126,7 @@
         <w:pStyle w:val="BodyText"/>
       </w:pPr>
       <w:r>
-        <w:t xml:space="preserve">O tronco: a coluna de bronze da grossura de um homem, embutida na parede da escada de serviço, que subia das Cisternas Quentes até o Sol. Ilan a tinha tocado quatro dias antes, subindo a escada, e a sentira fria e sob tensão. Era bronze maciço, duzentos e vinte metros dele, do alto da torre até o chão e abaixo do chão, até a rocha. E lá em cima, agarrada à armação da lente, estava uma dragoa de tempestade com a crista carregada até a ponta dos espinhos.</w:t>
+        <w:t xml:space="preserve">O tronco: a coluna de bronze da grossura de um homem, embutida na parede da escada de serviço, que subia das Cisternas Quentes até o Sol. Ilan a tinha tocado seis dias antes, subindo a escada, e a sentira fria e sob tensão. Era bronze maciço, duzentos e vinte metros dele, do alto da torre até o chão e abaixo do chão, até a rocha. E lá em cima, agarrada à armação da lente, estava uma dragoa de tempestade com a crista carregada até a ponta dos espinhos.</w:t>
       </w:r>
     </w:p>
     <w:p>
@@ -33641,7 +33641,7 @@
         <w:t xml:space="preserve"> </w:t>
       </w:r>
       <w:r>
-        <w:t xml:space="preserve">um instante antes da hora, porque estava cansada e porque tinha passado a tarde inteira segurando a porta de Neska aberta para o cobre. Ele empurrou quando ela disse, o piso do arco de saída não estava lá, e ele bateu na parede de novo, desta vez com o ombro direito. Ela gritou e correu até ele — e o encontrou sentado no chão, rindo, de olhos fechados, com as duas mãos apertando o flanco.</w:t>
+        <w:t xml:space="preserve">um instante antes da hora, porque estava cansada e porque tinha passado a manhã inteira segurando a porta de Neska aberta para o cobre. Ele empurrou quando ela disse, o piso do arco de saída não estava lá, e ele bateu na parede de novo, desta vez com o ombro direito. Ela gritou e correu até ele — e o encontrou sentado no chão, rindo, de olhos fechados, com as duas mãos apertando o flanco.</w:t>
       </w:r>
     </w:p>
     <w:p>
@@ -35998,7 +35998,7 @@
         <w:pStyle w:val="BodyText"/>
       </w:pPr>
       <w:r>
-        <w:t xml:space="preserve">Ilan tirou do bolso do colete a carta, dobrada nas três dobras, e a olhou mais uma vez. Depois a guardou de volta no bolso de dentro, junto ao peito, onde tinha guardado, doze dias antes, um fragmento de cerâmica com uma balança torta.</w:t>
+        <w:t xml:space="preserve">Ilan tirou do bolso do colete a carta, dobrada nas três dobras, e a olhou mais uma vez. Depois a guardou de volta no bolso de dentro, junto ao peito, onde tinha guardado, onze dias antes, um fragmento de cerâmica com uma balança torta.</w:t>
       </w:r>
     </w:p>
     <w:p>

</xml_diff>

<commit_message>
Mara, Nara e Sevran: texto alinhado aos retratos do banco de arte
Aparência e idades ajustadas em V1_revisao_linguagem e capitulos, para ficarem
coerentes com PE-003, PE-004 e PE-005. V1 original preservado intacto. Bíblia
interna, registro de continuidade e roteiro das cenas do Ilan atualizados.
PDF de luxo, PDF de gráfica, EPUB, MD e DOCX regenerados; o EPUB é válido.

Co-Authored-By: Claude Opus 5.5 <noreply@anthropic.com>
Claude-Session: https://claude.ai/code/session_01BuEux7GtVCf6Je6ZHYUtx2
</commit_message>
<xml_diff>
--- a/exportacoes/MANUSCRITO_V1_REVISAO_LINGUAGEM.docx
+++ b/exportacoes/MANUSCRITO_V1_REVISAO_LINGUAGEM.docx
@@ -362,7 +362,7 @@
         <w:pStyle w:val="BodyText"/>
       </w:pPr>
       <w:r>
-        <w:t xml:space="preserve">Ilan se virou. O homem que saía pela porta lateral com dois baldes de cinzas era alto e curvado, mas não pela idade: era o jeito de quem passa a vida abaixando a cabeça em portas baixas. Tinha barba grisalha, mãos grandes e um avental de cozinha por cima de um casaco que já tinha sido bom. Esvaziou os baldes num monte de cinza encostado à parede, onde algumas crianças catavam pedaços de carvão ainda morno, e se voltou para eles.</w:t>
+        <w:t xml:space="preserve">Ilan se virou. O homem que saía pela porta lateral com dois baldes de cinzas era alto e curvado, mas não pela idade: era o jeito de quem passa a vida abaixando a cabeça em portas baixas. Tinha o cabelo escuro e crespo salpicado de branco, barba grisalha, mãos grandes e um avental de cozinha por cima de um casaco que já tinha sido bom. Esvaziou os baldes num monte de cinza encostado à parede, onde algumas crianças catavam pedaços de carvão ainda morno, e se voltou para eles.</w:t>
       </w:r>
     </w:p>
     <w:p>
@@ -2142,7 +2142,7 @@
         <w:pStyle w:val="BodyText"/>
       </w:pPr>
       <w:r>
-        <w:t xml:space="preserve">Nara Voss era baixa e larga de ombros, com o cabelo ruivo-escuro amarrado num lenço sujo de graxa e os antebraços cobertos de velhas cicatrizes de queimadura que pareciam mapas de rios. Usava óculos de aumento empurrados para a testa e segurava um ferro de soldar. Não se levantou. Olhou para ele por cima da bancada como se ele fosse uma peça que alguém tinha largado ali sem etiqueta.</w:t>
+        <w:t xml:space="preserve">Nara Voss era baixa e larga de ombros, com o cabelo cor de cobre, ondulado, preso atrás num nó apertado, sardas no nariz e nas maçãs do rosto e os antebraços cobertos de velhas cicatrizes de queimadura que pareciam mapas de rios. Usava óculos de aumento empurrados para a testa e segurava um ferro de soldar. Não se levantou. Olhou para ele por cima da bancada como se ele fosse uma peça que alguém tinha largado ali sem etiqueta.</w:t>
       </w:r>
     </w:p>
     <w:p>
@@ -5826,7 +5826,7 @@
         <w:pStyle w:val="BodyText"/>
       </w:pPr>
       <w:r>
-        <w:t xml:space="preserve">Ao lado dela, um pouco recuada, numa cadeira posta de lado em relação à mesa — nem do lado da Comissária, nem do lado dele —, estava outra mulher. Mais velha que a Comissária, alta, magra, de cabelo grisalho cortado curto e rosto comprido, pele morena-clara, rugas finas nos cantos dos olhos. Tinha no colo uma maleta de couro aberta, cheia de placas finas de vidro arrumadas em fendas, como cartas num baralho, e segurava uma delas entre o polegar e o indicador, sem olhar para ela. Olhava para Ilan com uma atenção diferente da da Comissária: curiosa, sem hostilidade nenhuma. O que era pior.</w:t>
+        <w:t xml:space="preserve">Ao lado dela, um pouco recuada, numa cadeira posta de lado em relação à mesa — nem do lado da Comissária, nem do lado dele —, estava outra mulher. Mais nova que a Comissária, de uns trinta e poucos anos, alta, magra, de cabelo escuro preso num coque firme e rosto comprido, pele clara, óculos redondos de aro fino sobre olhos escuros e atentos. Usava um casaco escuro de gola alta por cima de um colete cor de vinho. Tinha no colo uma maleta de couro aberta, cheia de placas finas de vidro arrumadas em fendas, como cartas num baralho, e segurava uma delas entre o polegar e o indicador, sem olhar para ela. Olhava para Ilan com uma atenção diferente da da Comissária: curiosa, sem hostilidade nenhuma. O que era pior.</w:t>
       </w:r>
     </w:p>
     <w:p>
@@ -6788,7 +6788,7 @@
         <w:pStyle w:val="BodyText"/>
       </w:pPr>
       <w:r>
-        <w:t xml:space="preserve">Houve um silêncio. Mara Quen o observava com aquela atenção de pássaro, e ele soube, sem nenhuma dúvida, que ela tinha percebido a hesitação de antes e percebido esta, e que as duas estavam anotadas em algum lugar dentro daquela cabeça grisalha, ao lado da cláusula de permanência e do processo de 1179.</w:t>
+        <w:t xml:space="preserve">Houve um silêncio. Mara Quen o observava com aquela atenção de pássaro, e ele soube, sem nenhuma dúvida, que ela tinha percebido a hesitação de antes e percebido esta, e que as duas estavam anotadas em algum lugar atrás daqueles óculos redondos, ao lado da cláusula de permanência e do processo de 1179.</w:t>
       </w:r>
     </w:p>
     <w:p>
@@ -9034,7 +9034,7 @@
         <w:pStyle w:val="BodyText"/>
       </w:pPr>
       <w:r>
-        <w:t xml:space="preserve">— Do Delta. Mas leio relatórios de inverno há vinte anos.</w:t>
+        <w:t xml:space="preserve">— Do Delta. Mas leio relatórios de inverno há onze anos.</w:t>
       </w:r>
     </w:p>
     <w:p>
@@ -10432,7 +10432,7 @@
         <w:pStyle w:val="BodyText"/>
       </w:pPr>
       <w:r>
-        <w:t xml:space="preserve">— Eu ouvi o senhor perguntar ao Intendente, na tenda, enquanto a Soberania falava com os veladores — disse Mara Quen. — Se a Casa guardava documentos de serviços que a Ordem tivesse feito para ela. Ele disse que guardava. Disse que, depois da Noite das Sentenças, vieram homens da Câmara dos Pactos recolher tudo o que fosse da Ordem, de todos os arquivos da Concordata, e levaram. — Fez uma pausa. — Trabalho para a Câmara há vinte anos, senhor Varek. Nunca ouvi falar de nenhum recolhimento dos documentos da Ordem.</w:t>
+        <w:t xml:space="preserve">— Eu ouvi o senhor perguntar ao Intendente, na tenda, enquanto a Soberania falava com os veladores — disse Mara Quen. — Se a Casa guardava documentos de serviços que a Ordem tivesse feito para ela. Ele disse que guardava. Disse que, depois da Noite das Sentenças, vieram homens da Câmara dos Pactos recolher tudo o que fosse da Ordem, de todos os arquivos da Concordata, e levaram. — Fez uma pausa. — Trabalho para a Câmara há onze anos, senhor Varek. Nunca ouvi falar de nenhum recolhimento dos documentos da Ordem.</w:t>
       </w:r>
     </w:p>
     <w:p>
@@ -11225,7 +11225,7 @@
         <w:pStyle w:val="BodyText"/>
       </w:pPr>
       <w:r>
-        <w:t xml:space="preserve">— Ainda não. — Mara Quen não se levantou do banquinho. — Mas eu trabalho para a Câmara há vinte anos, Intendente, e nunca vi um único registro de recolhimento. Vou verificar. Se houve recolhimento, vai haver um auto, com o nome de quem recolheu e o de quem entregou. A Câmara não tira uma folha de papel de lugar nenhum sem um auto. É a coisa mais irritante e mais útil da Câmara.</w:t>
+        <w:t xml:space="preserve">— Ainda não. — Mara Quen não se levantou do banquinho. — Mas eu trabalho para a Câmara há onze anos, Intendente, e nunca vi um único registro de recolhimento. Vou verificar. Se houve recolhimento, vai haver um auto, com o nome de quem recolheu e o de quem entregou. A Câmara não tira uma folha de papel de lugar nenhum sem um auto. É a coisa mais irritante e mais útil da Câmara.</w:t>
       </w:r>
     </w:p>
     <w:p>
@@ -14457,7 +14457,7 @@
         <w:pStyle w:val="FirstParagraph"/>
       </w:pPr>
       <w:r>
-        <w:t xml:space="preserve">A oficina estava cheia de gente, de cobre, de fumaça de solda e de uma mulher baixa e ruiva, de lenço sujo de graxa e óculos de aumento na testa, ajoelhada no chão no meio de um emaranhado de tubos de cobre, gritando ordens para três rapazes e uma moça que corriam de um lado para o outro carregando coisas. Quando a porta abriu, ela levantou os olhos, viu Ilan e disse, sem se levantar:</w:t>
+        <w:t xml:space="preserve">A oficina estava cheia de gente, de cobre, de fumaça de solda e de uma mulher baixa e ruiva, de cabelo acobreado preso atrás e óculos de aumento na testa, ajoelhada no chão no meio de um emaranhado de tubos de cobre, gritando ordens para três rapazes e uma moça que corriam de um lado para o outro carregando coisas. Quando a porta abriu, ela levantou os olhos, viu Ilan e disse, sem se levantar:</w:t>
       </w:r>
     </w:p>
     <w:p>
@@ -17532,7 +17532,7 @@
         <w:pStyle w:val="BodyText"/>
       </w:pPr>
       <w:r>
-        <w:t xml:space="preserve">— O Carrasco me disse que as âncoras da trilha na torre eram falsas — disse ela, devagar. — Que gravavam a primeira resposta e a devolviam a quem batesse de novo. Que quem as fez sabia exatamente como um agrimensor bem treinado ia sondá-las. — Pegou a tigela vazia, olhou dentro dela e a pôs de volta na mesa. — Passei vinte anos confiando em registros, senhor Sevran, porque registros não querem nada. Mas alguém nesta cidade sabe fazer registros que querem.</w:t>
+        <w:t xml:space="preserve">— O Carrasco me disse que as âncoras da trilha na torre eram falsas — disse ela, devagar. — Que gravavam a primeira resposta e a devolviam a quem batesse de novo. Que quem as fez sabia exatamente como um agrimensor bem treinado ia sondá-las. — Pegou a tigela vazia, olhou dentro dela e a pôs de volta na mesa. — Passei onze anos confiando em registros, senhor Sevran, porque registros não querem nada. Mas alguém nesta cidade sabe fazer registros que querem.</w:t>
       </w:r>
     </w:p>
     <w:p>
@@ -18618,7 +18618,7 @@
         <w:pStyle w:val="BodyText"/>
       </w:pPr>
       <w:r>
-        <w:t xml:space="preserve">Mara leu o formulário duas vezes, devagar, linha por linha. Depois tirou da maleta o caderninho onde guardava, havia vinte anos, os artigos de estatuto que mais usava, e procurou um.</w:t>
+        <w:t xml:space="preserve">Mara leu o formulário duas vezes, devagar, linha por linha. Depois tirou da maleta o caderninho onde guardava, havia onze anos, os artigos de estatuto que mais usava, e procurou um.</w:t>
       </w:r>
     </w:p>
     <w:p>
@@ -22336,15 +22336,15 @@
         <w:pStyle w:val="BodyText"/>
       </w:pPr>
       <w:r>
-        <w:t xml:space="preserve">A auditora pensou na pergunta. Nara via que ela pensava: o rosto comprido e grisalho ficava imóvel daquele jeito de quando ela fazia uma conta.</w:t>
-      </w:r>
-    </w:p>
-    <w:p>
-      <w:pPr>
-        <w:pStyle w:val="BodyText"/>
-      </w:pPr>
-      <w:r>
-        <w:t xml:space="preserve">— Porque o Colégio dos Auditores de Pacto existe para verificar se as Coroas cumprem o que prometem — disse ela, por fim. — Não para aprender a matá-las. E porque alguém, nesta cidade, sabe matá-las. Alguém treinado pela sua Ordem, que não é o senhor. E de repente o Decanato do meu Colégio, que em vinte anos nunca se interessou pela Ordem, quer saber, com o máximo de pormenor possível, como o senhor faz o que faz. Na semana em que um deus morreu do jeito que o senhor sabe fazer. — Ela não piscou. — Eu não gosto de coincidências, senhor Varek. São registros que ainda não sabemos ler.</w:t>
+        <w:t xml:space="preserve">A auditora pensou na pergunta. Nara via que ela pensava: o rosto comprido, atrás dos óculos redondos, ficava imóvel daquele jeito de quando ela fazia uma conta.</w:t>
+      </w:r>
+    </w:p>
+    <w:p>
+      <w:pPr>
+        <w:pStyle w:val="BodyText"/>
+      </w:pPr>
+      <w:r>
+        <w:t xml:space="preserve">— Porque o Colégio dos Auditores de Pacto existe para verificar se as Coroas cumprem o que prometem — disse ela, por fim. — Não para aprender a matá-las. E porque alguém, nesta cidade, sabe matá-las. Alguém treinado pela sua Ordem, que não é o senhor. E de repente o Decanato do meu Colégio, que em onze anos nunca se interessou pela Ordem, quer saber, com o máximo de pormenor possível, como o senhor faz o que faz. Na semana em que um deus morreu do jeito que o senhor sabe fazer. — Ela não piscou. — Eu não gosto de coincidências, senhor Varek. São registros que ainda não sabemos ler.</w:t>
       </w:r>
     </w:p>
     <w:p>
@@ -27256,7 +27256,7 @@
         <w:pStyle w:val="BodyText"/>
       </w:pPr>
       <w:r>
-        <w:t xml:space="preserve">— Em Marenna. — Mara pôs as folhas de chá nas xícaras, devagar. — Eu tinha vinte e nove anos. Era auditora júnior do Colégio. Tinha sido mandada a Marenna em fevereiro de 1178 para auditar o contrato de manutenção da rede de água da cidade. A febre começou na segunda semana de março. A senhora fechou as portas na terceira.</w:t>
+        <w:t xml:space="preserve">— Em Marenna. — Mara pôs as folhas de chá nas xícaras, devagar. — Eu tinha vinte e três anos. Era auditora júnior do Colégio. Tinha sido mandada a Marenna em fevereiro de 1178 para auditar o contrato de manutenção da rede de água da cidade. A febre começou na segunda semana de março. A senhora fechou as portas na terceira.</w:t>
       </w:r>
     </w:p>
     <w:p>
@@ -27312,7 +27312,7 @@
         <w:pStyle w:val="BodyText"/>
       </w:pPr>
       <w:r>
-        <w:t xml:space="preserve">Aurelia olhou para ela. Olhou para o rosto comprido e grisalho, para as rugas finas nos cantos dos olhos, para as mãos que seguravam firme a xícara lascada, para a maleta de couro no chão, ao lado da cadeira. Pensou em todas as vezes, nos últimos sete dias, em que tinha olhado para aquela mulher e visto uma auditora. Pensou na pergunta que Mara tinha feito a ela no corredor da delegação, no primeiro dia:</w:t>
+        <w:t xml:space="preserve">Aurelia olhou para ela. Olhou para o rosto comprido, para os óculos redondos e o cabelo escuro preso no alto da cabeça, para as mãos que seguravam firme a xícara lascada, para a maleta de couro no chão, ao lado da cadeira. Pensou em todas as vezes, nos últimos sete dias, em que tinha olhado para aquela mulher e visto uma auditora. Pensou na pergunta que Mara tinha feito a ela no corredor da delegação, no primeiro dia:</w:t>
       </w:r>
       <w:r>
         <w:t xml:space="preserve"> </w:t>
@@ -29492,7 +29492,7 @@
         <w:pStyle w:val="BodyText"/>
       </w:pPr>
       <w:r>
-        <w:t xml:space="preserve">Estavam todos no gabinete do térreo da delegação da Câmara, o que nunca tinha acontecido antes. A Comissária atrás da mesa, com a curva de Nara presa na parede às costas. Mara sentada de lado, com a maleta no colo. Nara de pé junto à janela, de braços cruzados, com o lenço sujo de graxa na cabeça. Sevran na cadeira de espaldar reto junto à porta, com o gorro de lã nas mãos. A Soberania perto da estufa, que a Comissária tinha mandado acender com o carvão requisitado da Kaltz. Ilan encostado à parede do fundo, porque sentado as costelas doíam mais. E Thor, que não cabia em nenhuma cadeira do gabinete e tinha se sentado no chão, de pernas cruzadas, encostado à parede ao lado da porta: ocupava um terço da sala, com os joelhos na altura do queixo de Sevran.</w:t>
+        <w:t xml:space="preserve">Estavam todos no gabinete do térreo da delegação da Câmara, o que nunca tinha acontecido antes. A Comissária atrás da mesa, com a curva de Nara presa na parede às costas. Mara sentada de lado, com a maleta no colo. Nara de pé junto à janela, de braços cruzados, com os óculos de aumento na testa. Sevran na cadeira de espaldar reto junto à porta, com o gorro de lã nas mãos. A Soberania perto da estufa, que a Comissária tinha mandado acender com o carvão requisitado da Kaltz. Ilan encostado à parede do fundo, porque sentado as costelas doíam mais. E Thor, que não cabia em nenhuma cadeira do gabinete e tinha se sentado no chão, de pernas cruzadas, encostado à parede ao lado da porta: ocupava um terço da sala, com os joelhos na altura do queixo de Sevran.</w:t>
       </w:r>
     </w:p>
     <w:p>
@@ -30110,7 +30110,7 @@
         <w:pStyle w:val="BodyText"/>
       </w:pPr>
       <w:r>
-        <w:t xml:space="preserve">Tinha trazido. Nara Voss não saía de casa sem pelo menos um Pivô de Cobre na bolsa de ferramentas, assim como não saía sem o lenço na cabeça; Ilan tinha reparado nisso desde o primeiro dia. Era uma estaca de cobre do comprimento de um antebraço, grossa como dois dedos, com uma base larga de cerâmica e uma argola no alto para prender cabo. Uma âncora portátil de Carga, feita para ser cravada no chão e dar a um circuito de descarga uma saída segura. Ela a tirou da bolsa sem perguntar para quê. Ele viu que ela já sabia.</w:t>
+        <w:t xml:space="preserve">Tinha trazido. Nara Voss não saía de casa sem pelo menos um Pivô de Cobre na bolsa de ferramentas, assim como não saía sem os óculos de aumento na testa; Ilan tinha reparado nisso desde o primeiro dia. Era uma estaca de cobre do comprimento de um antebraço, grossa como dois dedos, com uma base larga de cerâmica e uma argola no alto para prender cabo. Uma âncora portátil de Carga, feita para ser cravada no chão e dar a um circuito de descarga uma saída segura. Ela a tirou da bolsa sem perguntar para quê. Ele viu que ela já sabia.</w:t>
       </w:r>
     </w:p>
     <w:p>
@@ -30499,7 +30499,7 @@
         <w:pStyle w:val="BodyText"/>
       </w:pPr>
       <w:r>
-        <w:t xml:space="preserve">Nara estava de pé a uns dez metros da cratera, com Tibo agarrado à cintura, olhando para o buraco. Tinha o lenço meio caído e o rosto preto de fuligem. Estava inteira.</w:t>
+        <w:t xml:space="preserve">Nara estava de pé a uns dez metros da cratera, com Tibo agarrado à cintura, olhando para o buraco. Tinha o cabelo meio solto e o rosto preto de fuligem. Estava inteira.</w:t>
       </w:r>
     </w:p>
     <w:p>
@@ -31229,7 +31229,7 @@
         <w:pStyle w:val="BodyText"/>
       </w:pPr>
       <w:r>
-        <w:t xml:space="preserve">Desceu devagar, degrau por degrau, com a maleta debaixo do braço, até o último. Depois pisou no rio congelado e andou pelo gelo rachado até ficar a dez metros da cabeça da dragoa, e ali parou. Uma mulher alta e magra, de cabelo grisalho cortado curto, de pé no gelo diante de uma criatura de trinta metros com uma crista de lâminas de raio. Da escadaria, Ilan viu que as mãos dela não tremiam, e soube que tremiam.</w:t>
+        <w:t xml:space="preserve">Desceu devagar, degrau por degrau, com a maleta debaixo do braço, até o último. Depois pisou no rio congelado e andou pelo gelo rachado até ficar a dez metros da cabeça da dragoa, e ali parou. Uma mulher alta e magra, de óculos redondos e cabelo escuro preso, de pé no gelo diante de uma criatura de trinta metros com uma crista de lâminas de raio. Da escadaria, Ilan viu que as mãos dela não tremiam, e soube que tremiam.</w:t>
       </w:r>
     </w:p>
     <w:p>
@@ -40261,7 +40261,7 @@
         <w:pStyle w:val="BodyText"/>
       </w:pPr>
       <w:r>
-        <w:t xml:space="preserve">Sevran se levantou também, mas devagar, porque tinha cinquenta e dois anos e os joelhos estalavam, e porque ainda não sabia o que o amigo ia fazer. Viu Oriel contornar a mesa. Pegar a capa laranja do prego atrás da porta, com as mãos enfaixadas, desajeitado, e jogá-la sobre os ombros. Tirar do bolso da túnica um molho de chaves de ferro.</w:t>
+        <w:t xml:space="preserve">Sevran se levantou também, mas devagar, porque tinha quarenta e cinco anos e os joelhos estalavam, e porque ainda não sabia o que o amigo ia fazer. Viu Oriel contornar a mesa. Pegar a capa laranja do prego atrás da porta, com as mãos enfaixadas, desajeitado, e jogá-la sobre os ombros. Tirar do bolso da túnica um molho de chaves de ferro.</w:t>
       </w:r>
     </w:p>
     <w:p>
@@ -40390,7 +40390,7 @@
         <w:pStyle w:val="BodyText"/>
       </w:pPr>
       <w:r>
-        <w:t xml:space="preserve">A calha estava coberta de geada. Sevran tinha cinquenta e dois anos e não era magro.</w:t>
+        <w:t xml:space="preserve">A calha estava coberta de geada. Sevran tinha quarenta e cinco anos e não era magro.</w:t>
       </w:r>
     </w:p>
     <w:p>
@@ -41474,7 +41474,7 @@
         <w:pStyle w:val="BodyText"/>
       </w:pPr>
       <w:r>
-        <w:t xml:space="preserve">— A minha. — Mara não se surpreendeu. Tinha passado vinte anos confiando naquela placa, e os últimos treze dias aprendendo que alguém em Vhalessa sabia fazer os registros dizerem o que ele queria. — Os discos são falsos. São iscas. Devolvem à placa a tensão que a placa espera, porque quem os pôs ali sabia que o Colégio mede pele de limiar com placa de aferição. As âncoras de verdade estão embaixo, no sal, onde a placa não alcança, porque o sal quente atrapalha a leitura. E onde ninguém pensaria em procurar, porque a placa já respondeu.</w:t>
+        <w:t xml:space="preserve">— A minha. — Mara não se surpreendeu. Tinha passado onze anos confiando naquela placa, e os últimos treze dias aprendendo que alguém em Vhalessa sabia fazer os registros dizerem o que ele queria. — Os discos são falsos. São iscas. Devolvem à placa a tensão que a placa espera, porque quem os pôs ali sabia que o Colégio mede pele de limiar com placa de aferição. As âncoras de verdade estão embaixo, no sal, onde a placa não alcança, porque o sal quente atrapalha a leitura. E onde ninguém pensaria em procurar, porque a placa já respondeu.</w:t>
       </w:r>
     </w:p>
     <w:p>

</xml_diff>

<commit_message>
Nara: nova direção visual do autor (PE-027 a PE-029) e texto alinhado
As três imagens geradas pelo autor no ChatGPT entram no banco de arte e passam a
ser a referência da Nara. Foram criados a ficha de continuidade (bloco fixo e
regra de inverno) e o texto alinhado nos caps. 2, 9 e 18 (trança longa, colete de
couro, luvas sem dedos, cinto de ferramentas). Também foram atualizados a ficha da
prancha PR-05, a Bíblia Visual, a bíblia interna, o roteiro e os prompts. O PDF de
luxo, o PDF de gráfica, o EPUB, o MD e o DOCX foram regenerados; o EPUB é válido.

Co-Authored-By: Claude Opus 5.5 <noreply@anthropic.com>
Claude-Session: https://claude.ai/code/session_01BuEux7GtVCf6Je6ZHYUtx2
</commit_message>
<xml_diff>
--- a/exportacoes/MANUSCRITO_V1_REVISAO_LINGUAGEM.docx
+++ b/exportacoes/MANUSCRITO_V1_REVISAO_LINGUAGEM.docx
@@ -2142,7 +2142,7 @@
         <w:pStyle w:val="BodyText"/>
       </w:pPr>
       <w:r>
-        <w:t xml:space="preserve">Nara Voss era baixa e larga de ombros, com o cabelo cor de cobre, ondulado, preso atrás num nó apertado, sardas no nariz e nas maçãs do rosto e os antebraços cobertos de velhas cicatrizes de queimadura que pareciam mapas de rios. Usava óculos de aumento empurrados para a testa e segurava um ferro de soldar. Não se levantou. Olhou para ele por cima da bancada como se ele fosse uma peça que alguém tinha largado ali sem etiqueta.</w:t>
+        <w:t xml:space="preserve">Nara Voss era baixa e larga de ombros, com o cabelo cor de cobre numa trança longa e grossa, de onde escapavam fios crespos, sardas no rosto e nos ombros e os antebraços cobertos de velhas cicatrizes de queimadura que pareciam mapas de rios. Usava um colete de couro sem mangas, luvas sem dedos e um cinto de ferramentas pesado, e tinha óculos de aumento de latão empurrados para a testa e segurava um ferro de soldar. Não se levantou. Olhou para ele por cima da bancada como se ele fosse uma peça que alguém tinha largado ali sem etiqueta.</w:t>
       </w:r>
     </w:p>
     <w:p>
@@ -14457,7 +14457,7 @@
         <w:pStyle w:val="FirstParagraph"/>
       </w:pPr>
       <w:r>
-        <w:t xml:space="preserve">A oficina estava cheia de gente, de cobre, de fumaça de solda e de uma mulher baixa e ruiva, de cabelo acobreado preso atrás e óculos de aumento na testa, ajoelhada no chão no meio de um emaranhado de tubos de cobre, gritando ordens para três rapazes e uma moça que corriam de um lado para o outro carregando coisas. Quando a porta abriu, ela levantou os olhos, viu Ilan e disse, sem se levantar:</w:t>
+        <w:t xml:space="preserve">A oficina estava cheia de gente, de cobre, de fumaça de solda e de uma mulher baixa e ruiva, de trança acobreada e óculos de aumento na testa, ajoelhada no chão no meio de um emaranhado de tubos de cobre, gritando ordens para três rapazes e uma moça que corriam de um lado para o outro carregando coisas. Quando a porta abriu, ela levantou os olhos, viu Ilan e disse, sem se levantar:</w:t>
       </w:r>
     </w:p>
     <w:p>
@@ -30499,7 +30499,7 @@
         <w:pStyle w:val="BodyText"/>
       </w:pPr>
       <w:r>
-        <w:t xml:space="preserve">Nara estava de pé a uns dez metros da cratera, com Tibo agarrado à cintura, olhando para o buraco. Tinha o cabelo meio solto e o rosto preto de fuligem. Estava inteira.</w:t>
+        <w:t xml:space="preserve">Nara estava de pé a uns dez metros da cratera, com Tibo agarrado à cintura, olhando para o buraco. Tinha a trança meio desfeita e o rosto preto de fuligem. Estava inteira.</w:t>
       </w:r>
     </w:p>
     <w:p>

</xml_diff>